<commit_message>
Removed bookmarks and updated table styles
</commit_message>
<xml_diff>
--- a/skills/render-themed-docs/assets/reference.docx
+++ b/skills/render-themed-docs/assets/reference.docx
@@ -1059,7 +1059,16 @@
     <w:unhideWhenUsed/>
     <w:qFormat/>
     <w:tblPr>
+      <w:tblStyleRowBandSize w:val="1"/>
       <w:tblInd w:w="0" w:type="dxa"/>
+      <w:tblBorders>
+        <w:top w:val="nil"/>
+        <w:left w:val="nil"/>
+        <w:bottom w:val="nil"/>
+        <w:right w:val="nil"/>
+        <w:insideH w:val="nil"/>
+        <w:insideV w:val="nil"/>
+      </w:tblBorders>
       <w:tblCellMar>
         <w:top w:w="0" w:type="dxa"/>
         <w:left w:w="108" w:type="dxa"/>
@@ -1074,10 +1083,12 @@
       </w:rPr>
       <w:tcPr>
         <w:shd w:val="clear" w:color="auto" w:fill="F2EDE9"/>
-        <w:tcBorders>
-          <w:bottom w:val="single"/>
-        </w:tcBorders>
         <w:vAlign w:val="bottom"/>
+      </w:tcPr>
+    </w:tblStylePr>
+    <w:tblStylePr w:type="band2Horz">
+      <w:tcPr>
+        <w:shd w:val="clear" w:color="auto" w:fill="F0F1F2"/>
       </w:tcPr>
     </w:tblStylePr>
   </w:style>

</xml_diff>

<commit_message>
Added border to renders
</commit_message>
<xml_diff>
--- a/skills/render-themed-docs/assets/reference.docx
+++ b/skills/render-themed-docs/assets/reference.docx
@@ -1062,12 +1062,12 @@
       <w:tblStyleRowBandSize w:val="1"/>
       <w:tblInd w:w="0" w:type="dxa"/>
       <w:tblBorders>
-        <w:top w:val="nil"/>
-        <w:left w:val="nil"/>
-        <w:bottom w:val="nil"/>
-        <w:right w:val="nil"/>
-        <w:insideH w:val="nil"/>
-        <w:insideV w:val="nil"/>
+        <w:top w:val="single" w:sz="4" w:space="0" w:color="D6D9E0"/>
+        <w:left w:val="single" w:sz="4" w:space="0" w:color="D6D9E0"/>
+        <w:bottom w:val="single" w:sz="4" w:space="0" w:color="D6D9E0"/>
+        <w:right w:val="single" w:sz="4" w:space="0" w:color="D6D9E0"/>
+        <w:insideH w:val="single" w:sz="4" w:space="0" w:color="D6D9E0"/>
+        <w:insideV w:val="single" w:sz="4" w:space="0" w:color="D6D9E0"/>
       </w:tblBorders>
       <w:tblCellMar>
         <w:top w:w="0" w:type="dxa"/>

</xml_diff>